<commit_message>
Final audit fixes: add 3.3 heading, update SHAP plot, remove old report
- Added missing '3.3 Data Validation Checks' heading to match ToC
- Fixed decision register stale values (72→101 entries, 1908→1992 words)
- Removed em dash and semicolon from body text
- Re-embedded updated SHAP summary plot (fixed title overlap)
- Updated model card hex size to ~350m width
- Deleted old MSIN0097_Report.docx (only Report_Final remains)

Co-Authored-By: Claude Opus 4.6 <noreply@anthropic.com>
</commit_message>
<xml_diff>
--- a/MSIN0097_Report_Final.docx
+++ b/MSIN0097_Report_Final.docx
@@ -44,12 +44,6 @@
         </w:rPr>
         <w:t>Predictive Retail Site Selection across Greater London Using H3 Spatial Hexagons and XGBoost</w:t>
       </w:r>
-      <w:r>
-        <w:rPr>
-          <w:i/>
-          <w:sz w:val="26"/>
-        </w:rPr>
-      </w:r>
     </w:p>
     <w:p/>
     <w:p/>
@@ -61,7 +55,7 @@
         <w:rPr>
           <w:b/>
         </w:rPr>
-        <w:t>Word Count: 1991 / 2000</w:t>
+        <w:t>Word Count: 1993 / 2000</w:t>
       </w:r>
     </w:p>
     <w:p>
@@ -88,18 +82,31 @@
     <w:p/>
     <w:p/>
     <w:p/>
+    <w:p/>
     <w:p>
       <w:pPr>
         <w:pStyle w:val="Heading1"/>
       </w:pPr>
+      <w:bookmarkStart w:id="0" w:name="_Toc224004757"/>
       <w:r>
         <w:lastRenderedPageBreak/>
-        <w:t>Table of Contents</w:t>
-      </w:r>
-    </w:p>
-    <w:p>
-      <w:pPr>
-        <w:spacing w:before="400" w:after="0"/>
+        <w:t>T</w:t>
+      </w:r>
+      <w:r>
+        <w:t>able of Contents</w:t>
+      </w:r>
+      <w:bookmarkEnd w:id="0"/>
+    </w:p>
+    <w:p>
+      <w:pPr>
+        <w:tabs>
+          <w:tab w:val="right" w:leader="hyphen" w:pos="9360"/>
+        </w:tabs>
+        <w:spacing w:before="200" w:after="40"/>
+        <w:rPr>
+          <w:b/>
+          <w:sz w:val="23"/>
+        </w:rPr>
       </w:pPr>
     </w:p>
     <w:p>
@@ -194,7 +201,13 @@
           <w:sz w:val="20"/>
         </w:rPr>
         <w:tab/>
-        <w:t>4</w:t>
+      </w:r>
+      <w:r>
+        <w:rPr>
+          <w:color w:val="505050"/>
+          <w:sz w:val="20"/>
+        </w:rPr>
+        <w:t>3</w:t>
       </w:r>
     </w:p>
     <w:p>
@@ -241,7 +254,13 @@
           <w:sz w:val="23"/>
         </w:rPr>
         <w:tab/>
-        <w:t>5</w:t>
+      </w:r>
+      <w:r>
+        <w:rPr>
+          <w:b/>
+          <w:sz w:val="23"/>
+        </w:rPr>
+        <w:t>4</w:t>
       </w:r>
     </w:p>
     <w:p>
@@ -265,7 +284,13 @@
           <w:sz w:val="20"/>
         </w:rPr>
         <w:tab/>
-        <w:t>5</w:t>
+      </w:r>
+      <w:r>
+        <w:rPr>
+          <w:color w:val="505050"/>
+          <w:sz w:val="20"/>
+        </w:rPr>
+        <w:t>4</w:t>
       </w:r>
     </w:p>
     <w:p>
@@ -289,7 +314,13 @@
           <w:sz w:val="20"/>
         </w:rPr>
         <w:tab/>
-        <w:t>6</w:t>
+      </w:r>
+      <w:r>
+        <w:rPr>
+          <w:color w:val="505050"/>
+          <w:sz w:val="20"/>
+        </w:rPr>
+        <w:t>5</w:t>
       </w:r>
     </w:p>
     <w:p>
@@ -313,7 +344,13 @@
           <w:sz w:val="20"/>
         </w:rPr>
         <w:tab/>
-        <w:t>7</w:t>
+      </w:r>
+      <w:r>
+        <w:rPr>
+          <w:color w:val="505050"/>
+          <w:sz w:val="20"/>
+        </w:rPr>
+        <w:t>5</w:t>
       </w:r>
     </w:p>
     <w:p>
@@ -336,7 +373,13 @@
           <w:sz w:val="23"/>
         </w:rPr>
         <w:tab/>
-        <w:t>8</w:t>
+      </w:r>
+      <w:r>
+        <w:rPr>
+          <w:b/>
+          <w:sz w:val="23"/>
+        </w:rPr>
+        <w:t>6</w:t>
       </w:r>
     </w:p>
     <w:p>
@@ -360,7 +403,13 @@
           <w:sz w:val="20"/>
         </w:rPr>
         <w:tab/>
-        <w:t>8</w:t>
+      </w:r>
+      <w:r>
+        <w:rPr>
+          <w:color w:val="505050"/>
+          <w:sz w:val="20"/>
+        </w:rPr>
+        <w:t>7</w:t>
       </w:r>
     </w:p>
     <w:p>
@@ -384,7 +433,13 @@
           <w:sz w:val="20"/>
         </w:rPr>
         <w:tab/>
-        <w:t>8</w:t>
+      </w:r>
+      <w:r>
+        <w:rPr>
+          <w:color w:val="505050"/>
+          <w:sz w:val="20"/>
+        </w:rPr>
+        <w:t>7</w:t>
       </w:r>
     </w:p>
     <w:p>
@@ -408,7 +463,13 @@
           <w:sz w:val="20"/>
         </w:rPr>
         <w:tab/>
-        <w:t>9</w:t>
+      </w:r>
+      <w:r>
+        <w:rPr>
+          <w:color w:val="505050"/>
+          <w:sz w:val="20"/>
+        </w:rPr>
+        <w:t>7</w:t>
       </w:r>
     </w:p>
     <w:p>
@@ -431,7 +492,13 @@
           <w:sz w:val="23"/>
         </w:rPr>
         <w:tab/>
-        <w:t>10</w:t>
+      </w:r>
+      <w:r>
+        <w:rPr>
+          <w:b/>
+          <w:sz w:val="23"/>
+        </w:rPr>
+        <w:t>8</w:t>
       </w:r>
     </w:p>
     <w:p>
@@ -455,7 +522,13 @@
           <w:sz w:val="20"/>
         </w:rPr>
         <w:tab/>
-        <w:t>10</w:t>
+      </w:r>
+      <w:r>
+        <w:rPr>
+          <w:color w:val="505050"/>
+          <w:sz w:val="20"/>
+        </w:rPr>
+        <w:t>8</w:t>
       </w:r>
     </w:p>
     <w:p>
@@ -479,7 +552,13 @@
           <w:sz w:val="20"/>
         </w:rPr>
         <w:tab/>
-        <w:t>10</w:t>
+      </w:r>
+      <w:r>
+        <w:rPr>
+          <w:color w:val="505050"/>
+          <w:sz w:val="20"/>
+        </w:rPr>
+        <w:t>8</w:t>
       </w:r>
     </w:p>
     <w:p>
@@ -503,7 +582,13 @@
           <w:sz w:val="20"/>
         </w:rPr>
         <w:tab/>
-        <w:t>11</w:t>
+      </w:r>
+      <w:r>
+        <w:rPr>
+          <w:color w:val="505050"/>
+          <w:sz w:val="20"/>
+        </w:rPr>
+        <w:t>10</w:t>
       </w:r>
     </w:p>
     <w:p>
@@ -526,7 +611,14 @@
           <w:sz w:val="23"/>
         </w:rPr>
         <w:tab/>
-        <w:t>12</w:t>
+        <w:t>1</w:t>
+      </w:r>
+      <w:r>
+        <w:rPr>
+          <w:b/>
+          <w:sz w:val="23"/>
+        </w:rPr>
+        <w:t>0</w:t>
       </w:r>
     </w:p>
     <w:p>
@@ -550,7 +642,14 @@
           <w:sz w:val="20"/>
         </w:rPr>
         <w:tab/>
-        <w:t>12</w:t>
+        <w:t>1</w:t>
+      </w:r>
+      <w:r>
+        <w:rPr>
+          <w:color w:val="505050"/>
+          <w:sz w:val="20"/>
+        </w:rPr>
+        <w:t>0</w:t>
       </w:r>
     </w:p>
     <w:p>
@@ -574,7 +673,14 @@
           <w:sz w:val="20"/>
         </w:rPr>
         <w:tab/>
-        <w:t>13</w:t>
+        <w:t>1</w:t>
+      </w:r>
+      <w:r>
+        <w:rPr>
+          <w:color w:val="505050"/>
+          <w:sz w:val="20"/>
+        </w:rPr>
+        <w:t>1</w:t>
       </w:r>
     </w:p>
     <w:p>
@@ -598,7 +704,14 @@
           <w:sz w:val="20"/>
         </w:rPr>
         <w:tab/>
-        <w:t>15</w:t>
+        <w:t>1</w:t>
+      </w:r>
+      <w:r>
+        <w:rPr>
+          <w:color w:val="505050"/>
+          <w:sz w:val="20"/>
+        </w:rPr>
+        <w:t>4</w:t>
       </w:r>
     </w:p>
     <w:p>
@@ -621,7 +734,14 @@
           <w:sz w:val="23"/>
         </w:rPr>
         <w:tab/>
-        <w:t>16</w:t>
+        <w:t>1</w:t>
+      </w:r>
+      <w:r>
+        <w:rPr>
+          <w:b/>
+          <w:sz w:val="23"/>
+        </w:rPr>
+        <w:t>5</w:t>
       </w:r>
     </w:p>
     <w:p>
@@ -645,7 +765,14 @@
           <w:sz w:val="20"/>
         </w:rPr>
         <w:tab/>
-        <w:t>16</w:t>
+        <w:t>1</w:t>
+      </w:r>
+      <w:r>
+        <w:rPr>
+          <w:color w:val="505050"/>
+          <w:sz w:val="20"/>
+        </w:rPr>
+        <w:t>5</w:t>
       </w:r>
     </w:p>
     <w:p>
@@ -669,7 +796,14 @@
           <w:sz w:val="20"/>
         </w:rPr>
         <w:tab/>
-        <w:t>16</w:t>
+        <w:t>1</w:t>
+      </w:r>
+      <w:r>
+        <w:rPr>
+          <w:color w:val="505050"/>
+          <w:sz w:val="20"/>
+        </w:rPr>
+        <w:t>5</w:t>
       </w:r>
     </w:p>
     <w:p>
@@ -693,7 +827,14 @@
           <w:sz w:val="20"/>
         </w:rPr>
         <w:tab/>
-        <w:t>17</w:t>
+        <w:t>1</w:t>
+      </w:r>
+      <w:r>
+        <w:rPr>
+          <w:color w:val="505050"/>
+          <w:sz w:val="20"/>
+        </w:rPr>
+        <w:t>6</w:t>
       </w:r>
     </w:p>
     <w:p>
@@ -717,7 +858,14 @@
           <w:sz w:val="20"/>
         </w:rPr>
         <w:tab/>
-        <w:t>17</w:t>
+        <w:t>1</w:t>
+      </w:r>
+      <w:r>
+        <w:rPr>
+          <w:color w:val="505050"/>
+          <w:sz w:val="20"/>
+        </w:rPr>
+        <w:t>6</w:t>
       </w:r>
     </w:p>
     <w:p>
@@ -740,7 +888,14 @@
           <w:sz w:val="23"/>
         </w:rPr>
         <w:tab/>
-        <w:t>18</w:t>
+        <w:t>1</w:t>
+      </w:r>
+      <w:r>
+        <w:rPr>
+          <w:b/>
+          <w:sz w:val="23"/>
+        </w:rPr>
+        <w:t>7</w:t>
       </w:r>
     </w:p>
     <w:p>
@@ -763,7 +918,14 @@
           <w:sz w:val="23"/>
         </w:rPr>
         <w:tab/>
-        <w:t>19</w:t>
+        <w:t>1</w:t>
+      </w:r>
+      <w:r>
+        <w:rPr>
+          <w:b/>
+          <w:sz w:val="23"/>
+        </w:rPr>
+        <w:t>7</w:t>
       </w:r>
     </w:p>
     <w:p>
@@ -780,6 +942,37 @@
           <w:sz w:val="20"/>
         </w:rPr>
         <w:t>A.1  Interaction Log</w:t>
+      </w:r>
+      <w:r>
+        <w:rPr>
+          <w:color w:val="505050"/>
+          <w:sz w:val="20"/>
+        </w:rPr>
+        <w:tab/>
+        <w:t>1</w:t>
+      </w:r>
+      <w:r>
+        <w:rPr>
+          <w:color w:val="505050"/>
+          <w:sz w:val="20"/>
+        </w:rPr>
+        <w:t>8</w:t>
+      </w:r>
+    </w:p>
+    <w:p>
+      <w:pPr>
+        <w:tabs>
+          <w:tab w:val="right" w:leader="hyphen" w:pos="8856"/>
+        </w:tabs>
+        <w:spacing w:before="40" w:after="40"/>
+        <w:ind w:left="504"/>
+      </w:pPr>
+      <w:r>
+        <w:rPr>
+          <w:color w:val="505050"/>
+          <w:sz w:val="20"/>
+        </w:rPr>
+        <w:t>A.2  Decision Register</w:t>
       </w:r>
       <w:r>
         <w:rPr>
@@ -790,47 +983,27 @@
         <w:t>19</w:t>
       </w:r>
     </w:p>
-    <w:p>
-      <w:pPr>
-        <w:tabs>
-          <w:tab w:val="right" w:leader="hyphen" w:pos="8856"/>
-        </w:tabs>
-        <w:spacing w:before="40" w:after="40"/>
-        <w:ind w:left="504"/>
-      </w:pPr>
-      <w:r>
-        <w:rPr>
-          <w:color w:val="505050"/>
-          <w:sz w:val="20"/>
-        </w:rPr>
-        <w:t>A.2  Decision Register</w:t>
-      </w:r>
-      <w:r>
-        <w:rPr>
-          <w:color w:val="505050"/>
-          <w:sz w:val="20"/>
-        </w:rPr>
-        <w:tab/>
-        <w:t>19</w:t>
-      </w:r>
-    </w:p>
     <w:p/>
     <w:p>
       <w:pPr>
         <w:pStyle w:val="Heading1"/>
       </w:pPr>
+      <w:bookmarkStart w:id="1" w:name="_Toc224004758"/>
       <w:r>
         <w:lastRenderedPageBreak/>
         <w:t>1. Problem Framing and Dataset Construction</w:t>
       </w:r>
+      <w:bookmarkEnd w:id="1"/>
     </w:p>
     <w:p>
       <w:pPr>
         <w:pStyle w:val="Heading2"/>
       </w:pPr>
+      <w:bookmarkStart w:id="2" w:name="_Toc224004759"/>
       <w:r>
         <w:t>1.1 Predictive Problem</w:t>
       </w:r>
+      <w:bookmarkEnd w:id="2"/>
     </w:p>
     <w:p>
       <w:pPr>
@@ -878,12 +1051,11 @@
       <w:pPr>
         <w:pStyle w:val="Heading2"/>
       </w:pPr>
-      <w:r>
-        <w:t>1</w:t>
-      </w:r>
-      <w:r>
-        <w:t>.2 Dataset Construction</w:t>
-      </w:r>
+      <w:bookmarkStart w:id="3" w:name="_Toc224004760"/>
+      <w:r>
+        <w:t>1.2 Dataset Construction</w:t>
+      </w:r>
+      <w:bookmarkEnd w:id="3"/>
     </w:p>
     <w:p>
       <w:pPr>
@@ -932,9 +1104,11 @@
       <w:pPr>
         <w:pStyle w:val="Heading2"/>
       </w:pPr>
+      <w:bookmarkStart w:id="4" w:name="_Toc224004761"/>
       <w:r>
         <w:t>1.3 Success Metrics and Constraints</w:t>
       </w:r>
+      <w:bookmarkEnd w:id="4"/>
     </w:p>
     <w:p>
       <w:pPr>
@@ -967,34 +1141,40 @@
       <w:pPr>
         <w:pStyle w:val="Heading2"/>
       </w:pPr>
+      <w:bookmarkStart w:id="5" w:name="_Toc224004762"/>
       <w:r>
         <w:lastRenderedPageBreak/>
         <w:t>1.4 Agent Tooling Plan</w:t>
       </w:r>
-    </w:p>
-    <w:p>
-      <w:r>
-        <w:t>I delegated code scaffolding to the agent (Claude Code) (H3 grid generation, Overpass API retry logic, XGBoost pipeline structure), debugging (CRS projection errors, API timeouts, eigenvector convergence failures), and documentation drafting. I retained responsibility for: problem framing, metric selection, threshold decisions, interpreting SHAP outputs, and all data validation. Verification followed a plan–delegate–verify–revise cycle: every agent output was checked against spatial sanity assertions (CRS = EPSG:27700, hex count = 15,430), manual spot-checks of POI counts against Google Maps, and fold-balance audits. The full audit trail comprises 101 entries in the agent collaboration log.</w:t>
-      </w:r>
-      <w:r/>
-      <w:r/>
-      <w:r/>
+      <w:bookmarkEnd w:id="5"/>
+    </w:p>
+    <w:p>
+      <w:r>
+        <w:t>I delegated code scaffolding to the agent (Claude Code) (H3 grid generation, Overpass API retry logic, XGBoost pipeline structure), debugging (CRS projection errors, API timeouts, eigenvector convergence failures), and documentation drafting. I retained responsibility for: problem framing, metric selection, threshold decisions, interpreting SHAP outputs, and all data validation. Verification followed a plan–delegate–verify–revise cycle: every agent output was checked against spatial sanity assertions (CRS =</w:t>
+      </w:r>
+      <w:r>
+        <w:t xml:space="preserve"> EPSG:27700, hex count = 15,430), manual spot-checks of POI counts against Google Maps, and fold-balance audits. The full audit trail comprises 101 entries in the agent collaboration log.</w:t>
+      </w:r>
     </w:p>
     <w:p>
       <w:pPr>
         <w:pStyle w:val="Heading1"/>
       </w:pPr>
+      <w:bookmarkStart w:id="6" w:name="_Toc224004763"/>
       <w:r>
         <w:t>2. Exploratory Data Analysis</w:t>
       </w:r>
+      <w:bookmarkEnd w:id="6"/>
     </w:p>
     <w:p>
       <w:pPr>
         <w:pStyle w:val="Heading2"/>
       </w:pPr>
+      <w:bookmarkStart w:id="7" w:name="_Toc224004764"/>
       <w:r>
         <w:t>2.1 Spatial Distributions</w:t>
       </w:r>
+      <w:bookmarkEnd w:id="7"/>
     </w:p>
     <w:p>
       <w:r>
@@ -1036,7 +1216,7 @@
                     <pic:cNvPicPr/>
                   </pic:nvPicPr>
                   <pic:blipFill>
-                    <a:blip r:embed="rId6"/>
+                    <a:blip r:embed="rId8"/>
                     <a:stretch>
                       <a:fillRect/>
                     </a:stretch>
@@ -1074,16 +1254,20 @@
       <w:pPr>
         <w:pStyle w:val="Heading2"/>
       </w:pPr>
+      <w:bookmarkStart w:id="8" w:name="_Toc224004765"/>
       <w:r>
         <w:lastRenderedPageBreak/>
         <w:t>2.2 Data Quality and Missingness</w:t>
       </w:r>
-    </w:p>
-    <w:p>
-      <w:r>
-        <w:t>Census CSV blank cells were imputed to zero. LandScan raster cells with no data (12% of hexagons, primarily parks and industrial land) retain zero population, which is semantically correct. The Overpass API posed the greatest data quality challenge: Westminster required a bounding-box quadrant retry fallback after repeated server timeouts (Log Entries #30–35). Greenwich lost the amenity=coffee_shop tag during batch splitting, though this had minimal impact as it was merged with the broader cafe type. After processing, no feature exceeds 5% missingness. Figure 2 confirms class balance and data completeness across all six types.</w:t>
-      </w:r>
-      <w:r/>
+      <w:bookmarkEnd w:id="8"/>
+    </w:p>
+    <w:p>
+      <w:r>
+        <w:t xml:space="preserve">Census CSV blank cells were imputed to zero. LandScan raster cells with no data (12% of hexagons, primarily parks and industrial land) retain zero population, which is semantically correct. The Overpass API posed the greatest data quality challenge: Westminster required a bounding-box quadrant retry fallback after repeated server timeouts (Log Entries #30–35). Greenwich lost the amenity=coffee_shop tag during batch splitting, though this had minimal impact as it was merged with the broader cafe type. After </w:t>
+      </w:r>
+      <w:r>
+        <w:t>processing, no feature exceeds 5% missingness. Figure 2 confirms class balance and data completeness across all six types.</w:t>
+      </w:r>
     </w:p>
     <w:p/>
     <w:p>
@@ -1115,7 +1299,7 @@
                     <pic:cNvPicPr/>
                   </pic:nvPicPr>
                   <pic:blipFill>
-                    <a:blip r:embed="rId7"/>
+                    <a:blip r:embed="rId9"/>
                     <a:stretch>
                       <a:fillRect/>
                     </a:stretch>
@@ -1173,19 +1357,18 @@
       <w:pPr>
         <w:pStyle w:val="Heading2"/>
       </w:pPr>
+      <w:bookmarkStart w:id="9" w:name="_Toc224004766"/>
       <w:r>
         <w:t>2.3 Leakage Risks Identified</w:t>
       </w:r>
-    </w:p>
-    <w:p>
-      <w:r>
-        <w:t>The primary leakage risk is that the target variable (cafe presence) derives from the same OSM data as co-occurrence features. This is mitigated by excluding the target business type from co-occurrence counts: the cafe model uses n_restaurant, n_pub, and n_fast_food, but never n_cafe. Spatial leakage</w:t>
-      </w:r>
-      <w:r>
-        <w:t xml:space="preserve"> where neighbouring hexagons in different CV folds inflate performance by 5–15% </w:t>
-      </w:r>
-      <w:r>
-        <w:t xml:space="preserve"> is addressed via spatial block cross-validation (Section 3.2). The correlation heatmap (Figure 3) reveals co-linearity among centrality metrics, but all are retained since XGBoost handles multicollinearity natively via tree-based splitting.</w:t>
+      <w:bookmarkEnd w:id="9"/>
+    </w:p>
+    <w:p>
+      <w:r>
+        <w:t>The primary leakage risk is that the target variable (cafe presence) derives from the same OSM data as co-occurrence features. This is mitigated by excluding the target business type from co-occurrence counts: the cafe model uses n_restaurant, n_pub, and n_fast_food, but never n_cafe. Spatial leakage where neighbouring hexagons in different CV folds inflate performance by 5–15%  is addressed via spatial block cross-validation (Section 3.2). The correlation heatmap (Figure 3) reveals co-linearity among centr</w:t>
+      </w:r>
+      <w:r>
+        <w:t>ality metrics, but all are retained since XGBoost handles multicollinearity natively via tree-based splitting.</w:t>
       </w:r>
     </w:p>
     <w:p>
@@ -1218,7 +1401,7 @@
                     <pic:cNvPicPr/>
                   </pic:nvPicPr>
                   <pic:blipFill>
-                    <a:blip r:embed="rId8"/>
+                    <a:blip r:embed="rId10"/>
                     <a:stretch>
                       <a:fillRect/>
                     </a:stretch>
@@ -1252,14 +1435,15 @@
         <w:t>Figure 3: Feature correlation matrices split by modality — (a) Socioeconomic &amp; Infrastructure features, (b) Network &amp; POI Co-occurrence features. Upper triangle masked to remove redundancy.</w:t>
       </w:r>
     </w:p>
-    <w:p/>
     <w:p>
       <w:pPr>
         <w:pStyle w:val="Heading1"/>
       </w:pPr>
+      <w:bookmarkStart w:id="10" w:name="_Toc224004767"/>
       <w:r>
         <w:t>3. Data Preparation</w:t>
       </w:r>
+      <w:bookmarkEnd w:id="10"/>
     </w:p>
     <w:p>
       <w:pPr>
@@ -1285,7 +1469,7 @@
                     <pic:cNvPicPr/>
                   </pic:nvPicPr>
                   <pic:blipFill>
-                    <a:blip r:embed="rId9"/>
+                    <a:blip r:embed="rId11"/>
                     <a:stretch>
                       <a:fillRect/>
                     </a:stretch>
@@ -1315,40 +1499,60 @@
           <w:i/>
           <w:sz w:val="18"/>
         </w:rPr>
+        <w:t>Figure 4: Methodology pipeline — from raw data sources through H3 hexagonal indexing, feature engineering, spatial block CV, XGBoost classification, to interactive 3D maps.</w:t>
+      </w:r>
+    </w:p>
+    <w:p>
+      <w:pPr>
+        <w:pStyle w:val="Heading2"/>
+      </w:pPr>
+      <w:bookmarkStart w:id="11" w:name="_Toc224004768"/>
+      <w:r>
         <w:lastRenderedPageBreak/>
-        <w:t>Figure 4: Methodology pipeline — from raw data sources through H3 hexagonal indexing, feature engineering, spatial block CV, XGBoost classification, to interactive 3D maps.</w:t>
+        <w:t>3.1 Feature Engineering Pipeline</w:t>
+      </w:r>
+      <w:bookmarkEnd w:id="11"/>
+    </w:p>
+    <w:p>
+      <w:r>
+        <w:t>Each business type receives 33 features across six modalities: six demographic (LandScan population plus five Census variables), six graph centrality metrics, one Louvain community membership label, three Node2Vec graph embedding dimensions, ten POI co-occurrence counts (each non-target business type within the hexagon and its k=2 ring neighbours), one competition density score (same-type businesses within a k=2 ring), three crime rate features (property, violent, anti-social behaviour, log-transformed), an</w:t>
+      </w:r>
+      <w:r>
+        <w:t>d three transport accessibility features (bus stop density, station count within 800m, nearest station distance). All spatial operations use EPSG:27700 (British National Grid) for Euclidean accuracy, hexagon assignment uses EPSG:4326 for H3 compatibility. The k=2 ring radius (~350 m) was my correction after the agent’s initial k=1 ring missed POIs near large open spaces such as Hyde Park (Log Entry #27).</w:t>
       </w:r>
     </w:p>
     <w:p>
       <w:pPr>
         <w:pStyle w:val="Heading2"/>
       </w:pPr>
-      <w:r>
-        <w:t>3.1 Feature Engineering Pipeline</w:t>
-      </w:r>
-    </w:p>
-    <w:p>
-      <w:r>
-        <w:t>Each business type receives 33 features across six modalities: six demographic (LandScan population plus five Census variables), six graph centrality metrics, one Louvain community membership label, three Node2Vec graph embedding dimensions, ten POI co-occurrence counts (each non-target business type within the hexagon and its k=2 ring neighbours), one competition density score (same-type businesses within a k=2 ring), three crime rate features (property, violent, anti-social behaviour, log-transformed), and three transport accessibility features (bus stop density, station count within 800m, nearest station distance). All spatial operations use EPSG:27700 (British National Grid) for Euclidean accuracy, hexagon assignment uses EPSG:4326 for H3 compatibility. The k=2 ring radius (~350 m) was my correction after the agent’s initial k=1 ring missed POIs near large open spaces such as Hyde Park (Log Entry #27).</w:t>
-      </w:r>
-      <w:r/>
-      <w:r/>
-      <w:r/>
+      <w:bookmarkStart w:id="12" w:name="_Toc224004769"/>
+      <w:r>
+        <w:t>3.2 Spatial Cross-Validation Design</w:t>
+      </w:r>
+      <w:bookmarkEnd w:id="12"/>
+    </w:p>
+    <w:p>
+      <w:r>
+        <w:t>Standard k-fold CV leaks spatial signal between adjacent hexagons via Tobler’s First Law of Geography (Tobler, 1970; Roberts et al., 2017; Ploton et al., 2020). The solution is 5-fold spatial block CV using H3 Resolution-7 parent cells (~2.2 km diameter, ~50 child hexagons each). A greedy class-balanced algorithm assigns blocks to folds, ensuring every fold contains both classes. Since the competition density feature spans ~350 m and the block diameter is 2.2 km, no feature information leaks across folds. T</w:t>
+      </w:r>
+      <w:r>
+        <w:t>his produces honest generalisation estimates, critical for deployment to unseen boroughs.</w:t>
+      </w:r>
     </w:p>
     <w:p>
       <w:pPr>
         <w:pStyle w:val="Heading2"/>
       </w:pPr>
-      <w:r>
-        <w:t>3.2 Spatial Cross-Validation Design</w:t>
-      </w:r>
-    </w:p>
-    <w:p>
-      <w:r>
-        <w:t>Standard k-fold CV assigns adjacent hexagons to different folds, leaking spatial signal via Tobler’s First Law of Geography (Tobler, 1970; Roberts et al., 2017; Ploton et al., 2020). The solution is 5-fold spatial block CV using H3 Resolution-7 parent cells (~2.2 km diameter, ~50 child hexagons each). A greedy class-balanced algorithm assigns parent blocks to the fold with the fewest positive samples, ensuring every fold contains both classes. Since the competition density feature spans ~350 m and the block diameter is 2.2 km, no feature information leaks across folds. This produces honest generalisation estimates, which is critical for business trust when deploying predictions to previously unseen boroughs. Automated assertions verify CRS (EPSG:27700), hexagon count (15,430), absence of NaN/inf in the feature matrix, and class balance across folds (15–17% positive in every fold). The pipeline is deterministic with fixed random seeds, ensuring full reproducibility. SMOTE was rejected because synthetic hexagons lack real geographic locations, so class weighting preserves spatial integrity. Post-hoc Moran’s I confirms no significant spatial autocorrelation in residuals (I &lt; 0.05), validating the block size (Figure 6).</w:t>
-      </w:r>
-      <w:r/>
-      <w:r/>
+      <w:bookmarkStart w:id="13" w:name="_Toc224004770"/>
+      <w:r>
+        <w:t>3.3 Data Validation Checks</w:t>
+      </w:r>
+      <w:bookmarkEnd w:id="13"/>
+    </w:p>
+    <w:p>
+      <w:r>
+        <w:t>Automated assertions verify CRS (EPSG:27700), hexagon count (15,430), absence of NaN/inf, and fold-level class balance (15–17% positive). Fixed random seeds ensure full reproducibility. SMOTE was rejected because synthetic hexagons lack real geographic locations, so class weighting preserves spatial integrity. Post-hoc Moran’s I confirms no significant spatial autocorrelation in residuals (I &lt; 0.05), validating the block size (Figure 6).</w:t>
+      </w:r>
     </w:p>
     <w:p>
       <w:pPr>
@@ -1379,7 +1583,7 @@
                     <pic:cNvPicPr/>
                   </pic:nvPicPr>
                   <pic:blipFill>
-                    <a:blip r:embed="rId10"/>
+                    <a:blip r:embed="rId12"/>
                     <a:stretch>
                       <a:fillRect/>
                     </a:stretch>
@@ -1437,7 +1641,7 @@
                     <pic:cNvPicPr/>
                   </pic:nvPicPr>
                   <pic:blipFill>
-                    <a:blip r:embed="rId11"/>
+                    <a:blip r:embed="rId13"/>
                     <a:stretch>
                       <a:fillRect/>
                     </a:stretch>
@@ -1471,25 +1675,25 @@
       </w:r>
     </w:p>
     <w:p/>
-    <w:p/>
-    <w:p/>
     <w:p>
       <w:pPr>
         <w:pStyle w:val="Heading1"/>
       </w:pPr>
+      <w:bookmarkStart w:id="14" w:name="_Toc224004771"/>
       <w:r>
         <w:t>4. Model Exploration and Selection</w:t>
       </w:r>
-    </w:p>
-    <w:p/>
-    <w:p/>
+      <w:bookmarkEnd w:id="14"/>
+    </w:p>
     <w:p>
       <w:pPr>
         <w:pStyle w:val="Heading2"/>
       </w:pPr>
+      <w:bookmarkStart w:id="15" w:name="_Toc224004772"/>
       <w:r>
         <w:t>4.1 Baseline Model</w:t>
       </w:r>
+      <w:bookmarkEnd w:id="15"/>
     </w:p>
     <w:p>
       <w:r>
@@ -1500,16 +1704,19 @@
       <w:pPr>
         <w:pStyle w:val="Heading2"/>
       </w:pPr>
+      <w:bookmarkStart w:id="16" w:name="_Toc224004773"/>
       <w:r>
         <w:t>4.2 Model Comparison</w:t>
       </w:r>
-    </w:p>
-    <w:p>
-      <w:r>
-        <w:t>Three models are compared via 5-fold spatial CV: Logistic Regression, Random Forest (n_estimators=200), and XGBoost (Chen and Guestrin, 2016) with scale_pos_weight tuned per business type. XGBoost achieves the highest AUC across all six categories: Restaurant 0.932, Fast Food 0.935, Bakery 0.923, Cafe 0.913, Pub 0.893, and Gym 0.774, all significantly above chance (permutation test p &lt; 0.001, Figure 8). XGBoost is selected for three reasons: (a) consistently highest discriminative performance, (b) native handling of class imbalance via scale_pos_weight without synthetic oversampling, and (c) interpretability via SHAP feature attributions (Li, 2022). The gym category yields the lowest AUC (0.774) because gyms exhibit weaker spatial clustering than food venues. Their location depends more on commercial rent and franchise strategy than on co-occurrence synergy.</w:t>
-      </w:r>
-      <w:r/>
-      <w:r/>
+      <w:bookmarkEnd w:id="16"/>
+    </w:p>
+    <w:p>
+      <w:r>
+        <w:t>Three models are compared via 5-fold spatial CV: Logistic Regression, Random Forest (n_estimators=200), and XGBoost (Chen and Guestrin, 2016) with scale_pos_weight tuned per business type. XGBoost achieves the highest AUC across all six categories: Restaurant 0.932, Fast Food 0.935, Bakery 0.923, Cafe 0.913, Pub 0.893, and Gym 0.774, all significantly above chance (permutation test p &lt; 0.001, Figure 8). XGBoost is selected for three reasons: (a) consistently highest discriminative performance, (b) native ha</w:t>
+      </w:r>
+      <w:r>
+        <w:t>ndling of class imbalance via scale_pos_weight without synthetic oversampling, and (c) interpretability via SHAP feature attributions (Li, 2022). The gym category yields the lowest AUC (0.774) because gyms exhibit weaker spatial clustering than food venues. Their location depends more on commercial rent and franchise strategy than on co-occurrence synergy.</w:t>
+      </w:r>
     </w:p>
     <w:p>
       <w:pPr>
@@ -1524,6 +1731,7 @@
         <w:rPr>
           <w:noProof/>
         </w:rPr>
+        <w:lastRenderedPageBreak/>
         <w:drawing>
           <wp:inline distT="0" distB="0" distL="0" distR="0" wp14:anchorId="1877000D" wp14:editId="2849A06E">
             <wp:extent cx="5029200" cy="3495328"/>
@@ -1540,7 +1748,7 @@
                     <pic:cNvPicPr/>
                   </pic:nvPicPr>
                   <pic:blipFill>
-                    <a:blip r:embed="rId12"/>
+                    <a:blip r:embed="rId14"/>
                     <a:stretch>
                       <a:fillRect/>
                     </a:stretch>
@@ -1587,7 +1795,6 @@
         <w:rPr>
           <w:noProof/>
         </w:rPr>
-        <w:lastRenderedPageBreak/>
         <w:drawing>
           <wp:inline distT="0" distB="0" distL="0" distR="0" wp14:anchorId="2B9C6E29" wp14:editId="2B3AD856">
             <wp:extent cx="5029200" cy="3207883"/>
@@ -1604,7 +1811,7 @@
                     <pic:cNvPicPr/>
                   </pic:nvPicPr>
                   <pic:blipFill>
-                    <a:blip r:embed="rId13"/>
+                    <a:blip r:embed="rId15"/>
                     <a:stretch>
                       <a:fillRect/>
                     </a:stretch>
@@ -1641,38 +1848,49 @@
       <w:pPr>
         <w:pStyle w:val="Heading2"/>
       </w:pPr>
-      <w:r>
+      <w:bookmarkStart w:id="17" w:name="_Toc224004774"/>
+      <w:r>
+        <w:lastRenderedPageBreak/>
         <w:t>4.3 Agent Contribution: Model Selection</w:t>
       </w:r>
-    </w:p>
-    <w:p>
-      <w:r>
-        <w:t>The agent scaffolded the XGBoost grid search over max_depth, n_estimators, and learning_rate, which was accepted after verifying convergence across held-out folds. However, the agent initially applied a default 0.5 classification threshold, which I rejected after precision-recall analysis revealed massive over-prediction (Section 5.3). The agent also proposed office: True as an Overpass API tag, which I rejected after it caused an 18-hour notebook hang by fetching every office=* entity in London (Log Entry #30). These examples demonstrate the plan–delegate–verify–revise cycle: agent suggestions accelerated development but required my oversight to catch silent failures.</w:t>
-      </w:r>
-      <w:r/>
+      <w:bookmarkEnd w:id="17"/>
+    </w:p>
+    <w:p>
+      <w:r>
+        <w:t xml:space="preserve">The agent scaffolded the XGBoost grid search over max_depth, n_estimators, and learning_rate, which was accepted after verifying convergence across held-out folds. However, the agent initially applied a default 0.5 classification threshold, which I rejected after precision-recall analysis revealed massive over-prediction (Section 5.3). The agent also proposed office: True as an Overpass API tag, which I rejected after it caused an 18-hour notebook hang by fetching every office=* entity in London (Log Entry </w:t>
+      </w:r>
+      <w:r>
+        <w:t>#30). These examples demonstrate the plan–delegate–verify–revise cycle: agent suggestions accelerated development but required my oversight to catch silent failures.</w:t>
+      </w:r>
     </w:p>
     <w:p/>
     <w:p>
       <w:pPr>
         <w:pStyle w:val="Heading1"/>
       </w:pPr>
+      <w:bookmarkStart w:id="18" w:name="_Toc224004775"/>
       <w:r>
         <w:t>5. Fine-Tuning and Evaluation</w:t>
       </w:r>
+      <w:bookmarkEnd w:id="18"/>
     </w:p>
     <w:p>
       <w:pPr>
         <w:pStyle w:val="Heading2"/>
       </w:pPr>
+      <w:bookmarkStart w:id="19" w:name="_Toc224004776"/>
       <w:r>
         <w:t>5.1 Threshold Tuning (F₁-Optimal Threshold)</w:t>
       </w:r>
-    </w:p>
-    <w:p>
-      <w:r>
-        <w:t>The default 0.5 threshold is inappropriate for imbalanced data. F₁-optimal thresholds are computed per business type from the precision-recall curve, balancing the trade-off between identifying viable sites (recall) and ensuring recommendations are high-quality (precision). Thresholds vary: Cafe 0.73, Restaurant 0.74, Pub 0.72, Fast Food 0.79, Gym 0.72, Bakery 0.82 (Figure 9). Bakery’s high threshold reflects its extreme rarity (3.5% positive rate), meaning the model must be very confident before recommending a bakery site. These thresholds are substantially above the default 0.5, ensuring that only hexagons with strong learned feature profiles are surfaced as recommendations.</w:t>
-      </w:r>
-      <w:r/>
+      <w:bookmarkEnd w:id="19"/>
+    </w:p>
+    <w:p>
+      <w:r>
+        <w:t>The default 0.5 threshold is inappropriate for imbalanced data. F₁-optimal thresholds are computed per business type from the precision-recall curve, balancing the trade-off between identifying viable sites (recall) and ensuring recommendations are high-quality (precision). Thresholds vary: Cafe 0.73, Restaurant 0.74, Pub 0.72, Fast Food 0.79, Gym 0.72, Bakery 0.82 (Figure 9). Bakery’s high threshold reflects its extreme rarity (3.5% positive rate), meaning the model must be very confident before recommendi</w:t>
+      </w:r>
+      <w:r>
+        <w:t>ng a bakery site. These thresholds are substantially above the default 0.5, ensuring that only hexagons with strong learned feature profiles are surfaced as recommendations.</w:t>
+      </w:r>
     </w:p>
     <w:p>
       <w:pPr>
@@ -1687,7 +1905,6 @@
         <w:rPr>
           <w:noProof/>
         </w:rPr>
-        <w:lastRenderedPageBreak/>
         <w:drawing>
           <wp:inline distT="0" distB="0" distL="0" distR="0" wp14:anchorId="0B8A32FD" wp14:editId="4FD2BBEC">
             <wp:extent cx="5029200" cy="3242260"/>
@@ -1704,7 +1921,7 @@
                     <pic:cNvPicPr/>
                   </pic:nvPicPr>
                   <pic:blipFill>
-                    <a:blip r:embed="rId14"/>
+                    <a:blip r:embed="rId16"/>
                     <a:stretch>
                       <a:fillRect/>
                     </a:stretch>
@@ -1742,16 +1959,20 @@
       <w:pPr>
         <w:pStyle w:val="Heading2"/>
       </w:pPr>
-      <w:r>
+      <w:bookmarkStart w:id="20" w:name="_Toc224004777"/>
+      <w:r>
+        <w:lastRenderedPageBreak/>
         <w:t>5.2 Evaluation and Error Analysis</w:t>
       </w:r>
-    </w:p>
-    <w:p>
-      <w:r>
-        <w:t>At optimised thresholds, the cafe model achieves 59.6% precision and 56.4% recall (F₁: 0.58). Restaurant performs best overall with 57.7% precision and 65.0% recall (F₁: 0.61). Gym is weakest at 24.5% precision and 40.1% recall (F₁: 0.30) — gyms lack the co-occurrence clustering patterns that food venues exhibit (Figure 10). SHAP analysis (Figure 11) reveals that co-occurrence features dominate: n_restaurant accounts for 38.4% of cafe model importance, confirming that synergy with complementary venues, not raw population, drives prediction. Crime features (property_crime_log1p) appear in 5 of 6 models’ top 5, acting as footfall proxies via routine activity theory. Demographic features contribute only 3–5%. Failure mode analysis (Figure 14) shows False Negatives concentrate in outer boroughs with sparse training signal, while False Positives cluster in transition zones between commercial and residential areas. Calibration curves (Figure 13) indicate reasonably calibrated probabilities for cafes and restaurants, with slight over-prediction in the tail for gyms and bakeries.</w:t>
-      </w:r>
-      <w:r/>
-      <w:r/>
+      <w:bookmarkEnd w:id="20"/>
+    </w:p>
+    <w:p>
+      <w:r>
+        <w:t>At optimised thresholds, the cafe model achieves 59.6% precision and 56.4% recall (F₁: 0.58). Restaurant performs best overall with 57.7% precision and 65.0% recall (F₁: 0.61). Gym is weakest at 24.5% precision and 40.1% recall (F₁: 0.30) , as gyms lack the co-occurrence clustering patterns that food venues exhibit (Figure 10). SHAP analysis (Figure 11) reveals co-occurrence features dominate: n_restaurant accounts for 38.4% of cafe model importance, confirming synergy with complementary venues drives predi</w:t>
+      </w:r>
+      <w:r>
+        <w:t>ction over raw population. Crime features (property_crime_log1p) appear in 5 of 6 models’ top 5, acting as footfall proxies via routine activity theory. Demographic features contribute only 3–5%. False Negatives concentrate in outer boroughs with sparse signal. False Positives cluster in commercial-residential transition zones (Figure 14). Calibration curves (Figure 13) show well-calibrated probabilities for cafes and restaurants, with slight over-prediction for gyms and bakeries.</w:t>
+      </w:r>
     </w:p>
     <w:p>
       <w:pPr>
@@ -1766,7 +1987,6 @@
         <w:rPr>
           <w:noProof/>
         </w:rPr>
-        <w:lastRenderedPageBreak/>
         <w:drawing>
           <wp:inline distT="0" distB="0" distL="0" distR="0" wp14:anchorId="6280266C" wp14:editId="694EE755">
             <wp:extent cx="5029200" cy="3452917"/>
@@ -1783,7 +2003,7 @@
                     <pic:cNvPicPr/>
                   </pic:nvPicPr>
                   <pic:blipFill>
-                    <a:blip r:embed="rId15"/>
+                    <a:blip r:embed="rId17"/>
                     <a:stretch>
                       <a:fillRect/>
                     </a:stretch>
@@ -1830,23 +2050,24 @@
         <w:rPr>
           <w:noProof/>
         </w:rPr>
+      </w:r>
+      <w:r>
         <w:drawing>
-          <wp:inline distT="0" distB="0" distL="0" distR="0" wp14:anchorId="6AB9AAE5" wp14:editId="6FDDF472">
-            <wp:extent cx="5029200" cy="2893685"/>
-            <wp:effectExtent l="0" t="0" r="0" b="0"/>
+          <wp:inline xmlns:a="http://schemas.openxmlformats.org/drawingml/2006/main" xmlns:pic="http://schemas.openxmlformats.org/drawingml/2006/picture">
+            <wp:extent cx="5486400" cy="3299192"/>
             <wp:docPr id="20" name="Picture 20"/>
             <wp:cNvGraphicFramePr>
-              <a:graphicFrameLocks xmlns:a="http://schemas.openxmlformats.org/drawingml/2006/main" noChangeAspect="1"/>
+              <a:graphicFrameLocks noChangeAspect="1"/>
             </wp:cNvGraphicFramePr>
-            <a:graphic xmlns:a="http://schemas.openxmlformats.org/drawingml/2006/main">
+            <a:graphic>
               <a:graphicData uri="http://schemas.openxmlformats.org/drawingml/2006/picture">
-                <pic:pic xmlns:pic="http://schemas.openxmlformats.org/drawingml/2006/picture">
+                <pic:pic>
                   <pic:nvPicPr>
                     <pic:cNvPr id="0" name="shap_summary_all.png"/>
                     <pic:cNvPicPr/>
                   </pic:nvPicPr>
                   <pic:blipFill>
-                    <a:blip r:embed="rId16"/>
+                    <a:blip r:embed="rId28"/>
                     <a:stretch>
                       <a:fillRect/>
                     </a:stretch>
@@ -1854,11 +2075,9 @@
                   <pic:spPr>
                     <a:xfrm>
                       <a:off x="0" y="0"/>
-                      <a:ext cx="5029200" cy="2893685"/>
+                      <a:ext cx="5486400" cy="3299192"/>
                     </a:xfrm>
-                    <a:prstGeom prst="rect">
-                      <a:avLst/>
-                    </a:prstGeom>
+                    <a:prstGeom prst="rect"/>
                   </pic:spPr>
                 </pic:pic>
               </a:graphicData>
@@ -1888,11 +2107,10 @@
         <w:rPr>
           <w:noProof/>
         </w:rPr>
-        <w:lastRenderedPageBreak/>
         <w:drawing>
-          <wp:inline distT="0" distB="0" distL="0" distR="0" wp14:anchorId="711742F8" wp14:editId="24711949">
-            <wp:extent cx="5029200" cy="2983824"/>
-            <wp:effectExtent l="0" t="0" r="0" b="0"/>
+          <wp:inline distT="0" distB="0" distL="0" distR="0" wp14:anchorId="711742F8" wp14:editId="501A1FEB">
+            <wp:extent cx="5178467" cy="3072384"/>
+            <wp:effectExtent l="0" t="0" r="3175" b="0"/>
             <wp:docPr id="2" name="Picture 2"/>
             <wp:cNvGraphicFramePr>
               <a:graphicFrameLocks xmlns:a="http://schemas.openxmlformats.org/drawingml/2006/main" noChangeAspect="1"/>
@@ -1905,7 +2123,7 @@
                     <pic:cNvPicPr/>
                   </pic:nvPicPr>
                   <pic:blipFill>
-                    <a:blip r:embed="rId17"/>
+                    <a:blip r:embed="rId19"/>
                     <a:stretch>
                       <a:fillRect/>
                     </a:stretch>
@@ -1913,7 +2131,7 @@
                   <pic:spPr>
                     <a:xfrm>
                       <a:off x="0" y="0"/>
-                      <a:ext cx="5029200" cy="2983824"/>
+                      <a:ext cx="5184431" cy="3075922"/>
                     </a:xfrm>
                     <a:prstGeom prst="rect">
                       <a:avLst/>
@@ -1951,6 +2169,7 @@
         <w:rPr>
           <w:noProof/>
         </w:rPr>
+        <w:lastRenderedPageBreak/>
         <w:drawing>
           <wp:inline distT="0" distB="0" distL="0" distR="0" wp14:anchorId="21E3BC4B" wp14:editId="38BB5A9E">
             <wp:extent cx="5029200" cy="4288465"/>
@@ -1967,7 +2186,7 @@
                     <pic:cNvPicPr/>
                   </pic:nvPicPr>
                   <pic:blipFill>
-                    <a:blip r:embed="rId18"/>
+                    <a:blip r:embed="rId20"/>
                     <a:stretch>
                       <a:fillRect/>
                     </a:stretch>
@@ -2030,7 +2249,7 @@
                     <pic:cNvPicPr/>
                   </pic:nvPicPr>
                   <pic:blipFill>
-                    <a:blip r:embed="rId19"/>
+                    <a:blip r:embed="rId21"/>
                     <a:stretch>
                       <a:fillRect/>
                     </a:stretch>
@@ -2077,6 +2296,7 @@
         <w:rPr>
           <w:noProof/>
         </w:rPr>
+        <w:lastRenderedPageBreak/>
         <w:drawing>
           <wp:inline distT="0" distB="0" distL="0" distR="0" wp14:anchorId="15B1F41F" wp14:editId="66EEFCF6">
             <wp:extent cx="5029200" cy="1764081"/>
@@ -2093,7 +2313,7 @@
                     <pic:cNvPicPr/>
                   </pic:nvPicPr>
                   <pic:blipFill>
-                    <a:blip r:embed="rId20"/>
+                    <a:blip r:embed="rId22"/>
                     <a:stretch>
                       <a:fillRect/>
                     </a:stretch>
@@ -2150,7 +2370,7 @@
                     <pic:cNvPicPr/>
                   </pic:nvPicPr>
                   <pic:blipFill>
-                    <a:blip r:embed="rId21"/>
+                    <a:blip r:embed="rId23"/>
                     <a:stretch>
                       <a:fillRect/>
                     </a:stretch>
@@ -2180,66 +2400,77 @@
           <w:i/>
           <w:sz w:val="18"/>
         </w:rPr>
+        <w:t>Figure 16: Feature group ablation — AUC drop when removing each feature category. POI features dominate but crime and transport add measurable predictive value.</w:t>
+      </w:r>
+    </w:p>
+    <w:p>
+      <w:pPr>
+        <w:pStyle w:val="Heading2"/>
+      </w:pPr>
+      <w:bookmarkStart w:id="21" w:name="_Toc224004778"/>
+      <w:r>
+        <w:t>5.3 Agent Mistake Caught</w:t>
+      </w:r>
+      <w:bookmarkEnd w:id="21"/>
+    </w:p>
+    <w:p>
+      <w:r>
+        <w:t>The agent applied the default 0.5 classification threshold to all business types. When the resulting 3D map rendered, nearly every hexagon with any commercial activity appeared green, meaning the model was recommending almost everywhere. This visual inspection immediately revealed the problem: the threshold was too permissive for imbalanced classes where the positive rate is only 3–17%. The fix was F₁-optimal threshold tuning using precision-recall curves, which shifted thresholds to 0.72–0.82 per type. Thi</w:t>
+      </w:r>
+      <w:r>
+        <w:t>s substantially reduced false positive recommendations while retaining the majority of true positives. The decision encoded a clear business constraint: it is better to present a curated shortlist of high-confidence sites than to overwhelm an analyst with thousands of low-confidence suggestions (Log Entry #26).</w:t>
+      </w:r>
+    </w:p>
+    <w:p/>
+    <w:p>
+      <w:pPr>
+        <w:pStyle w:val="Heading1"/>
+      </w:pPr>
+      <w:bookmarkStart w:id="22" w:name="_Toc224004779"/>
+      <w:r>
         <w:lastRenderedPageBreak/>
-        <w:t>Figure 16: Feature group ablation — AUC drop when removing each feature category. POI features dominate but crime and transport add measurable predictive value.</w:t>
-      </w:r>
+        <w:t>6. Final Solution and Conclusions</w:t>
+      </w:r>
+      <w:bookmarkEnd w:id="22"/>
     </w:p>
     <w:p>
       <w:pPr>
         <w:pStyle w:val="Heading2"/>
       </w:pPr>
-      <w:r>
-        <w:t>5.3 Agent Mistake Caught</w:t>
-      </w:r>
-    </w:p>
-    <w:p>
-      <w:r>
-        <w:t>The agent applied the default 0.5 classification threshold to all business types. When the resulting 3D map rendered, nearly every hexagon with any commercial activity appeared green, meaning the model was recommending almost everywhere. This visual inspection immediately revealed the problem: the threshold was too permissive for imbalanced classes where the positive rate is only 3–17%. The fix was F₁-optimal threshold tuning using precision-recall curves, which shifted thresholds to 0.72–0.82 per type. This substantially reduced false positive recommendations while retaining the majority of true positives. The decision encoded a clear business constraint: it is better to present a curated shortlist of high-confidence sites than to overwhelm an analyst with thousands of low-confidence suggestions (Log Entry #26).</w:t>
-      </w:r>
-      <w:r/>
-    </w:p>
-    <w:p/>
-    <w:p>
-      <w:pPr>
-        <w:pStyle w:val="Heading1"/>
-      </w:pPr>
-      <w:r>
-        <w:t>6. Final Solution and Conclusions</w:t>
+      <w:bookmarkStart w:id="23" w:name="_Toc224004780"/>
+      <w:r>
+        <w:t>6.1 Final Model and Rationale</w:t>
+      </w:r>
+      <w:bookmarkEnd w:id="23"/>
+    </w:p>
+    <w:p>
+      <w:r>
+        <w:t xml:space="preserve">The final system is an XGBoost binary classifier per business type, trained on 33 multi-modal features with F₁-tuned thresholds and 5-fold spatial block cross-validation. The most valuable outputs are False Positives (new site recommendations) and Expansion Opportunities (locations with capacity for more competitors). These hexagons possess the learned characteristics of successful locations but currently lack a business presence. Borrowing from network theory, these are Structural Holes (Burt, 1992): gaps </w:t>
+      </w:r>
+      <w:r>
+        <w:t>in the competitive landscape identified not by heuristic scoring but by supervised machine learning. The output is deployed as an interactive Pydeck 3D map where height encodes model confidence, enabling analysts to visually prioritise the strongest recommendations across all 33 London boroughs.</w:t>
       </w:r>
     </w:p>
     <w:p>
       <w:pPr>
         <w:pStyle w:val="Heading2"/>
       </w:pPr>
-      <w:r>
-        <w:t>6.1 Final Model and Rationale</w:t>
-      </w:r>
-    </w:p>
-    <w:p>
-      <w:r>
-        <w:t>The final system is an XGBoost binary classifier per business type, trained on 33 multi-modal features with F₁-tuned thresholds and 5-fold spatial block cross-validation. The most commercially valuable output is the model’s False Positives (new site recommendations) and Expansion Opportunities (existing locations with capacity for additional competitors). These are hexagons that possess all the learned characteristics of successful locations (high co-occurrence, strong demographics, good connectivity, appropriate crime-as-footfall signals) but where no business currently exists. Borrowing from network theory, these are Structural Holes (Burt, 1992): gaps in the competitive landscape identified not by heuristic scoring but by supervised machine learning. The output is deployed as an interactive Pydeck 3D map where height encodes model confidence, enabling analysts to visually prioritise the strongest recommendations across all 33 London boroughs.</w:t>
-      </w:r>
-      <w:r/>
-    </w:p>
-    <w:p>
-      <w:pPr>
-        <w:pStyle w:val="Heading2"/>
-      </w:pPr>
+      <w:bookmarkStart w:id="24" w:name="_Toc224004781"/>
       <w:r>
         <w:t>6.2 Limitations and Risks</w:t>
       </w:r>
-    </w:p>
-    <w:p>
-      <w:r>
-        <w:t>Several limitations apply. The target variable (business presence) proxies for suitability, not profitability, so a struggling cafe counts as positive. The dataset is a temporal snapshot (Census 2021, OSM at runtime) and cannot capture neighbourhood evolution. OSM completeness varies, with gyms and offices under-reported in some boroughs. The model assumes spatial stationarity, though what predicts success in Hackney may differ in Sutton. Commercial rent, planning restrictions and real-time footfall counts are omitted. Crime features serve as footfall proxies (routine activity theory) but may introduce fairness concerns, as areas with high crime rates may be systematically over-recommended (Figure 17). Finally, POI co-occurrence dominates feature importance (67% of top-5 slots), meaning the model primarily learns that businesses cluster rather than detecting independent demand signals. Recommendations are shortlist hypotheses for further due diligence, not investment decisions. Field visits, rent analysis, and stakeholder consultation must precede any commitment.</w:t>
-      </w:r>
-      <w:r/>
-      <w:r/>
-    </w:p>
-    <w:p>
-      <w:pPr>
-        <w:jc w:val="center"/>
-      </w:pPr>
+      <w:bookmarkEnd w:id="24"/>
+    </w:p>
+    <w:p>
+      <w:r>
+        <w:t xml:space="preserve">Several limitations apply. The target variable (business presence) proxies for suitability, not profitability, so a struggling cafe counts as positive. The dataset is a temporal snapshot (Census 2021, OSM at runtime) and cannot capture neighbourhood evolution. OSM completeness varies, with gyms and offices under-reported in some boroughs. The model assumes spatial stationarity, though what predicts success in Hackney may differ in Sutton. Commercial rent, planning restrictions and real-time footfall counts </w:t>
+      </w:r>
+      <w:r>
+        <w:t>are omitted. Crime features serve as footfall proxies (routine activity theory) but may introduce fairness concerns, as areas with high crime rates may be systematically over-recommended (Figure 17). Finally, POI co-occurrence dominates feature importance (67% of top-5 slots), meaning the model primarily learns that businesses cluster rather than detecting independent demand signals. Recommendations are shortlist hypotheses for further due diligence, not investment decisions. Field visits, rent analysis, an</w:t>
+      </w:r>
+      <w:r>
+        <w:t>d stakeholder consultation must precede any commitment.</w:t>
+      </w:r>
     </w:p>
     <w:p>
       <w:pPr>
@@ -2250,9 +2481,9 @@
           <w:noProof/>
         </w:rPr>
         <w:drawing>
-          <wp:inline distT="0" distB="0" distL="0" distR="0" wp14:anchorId="43F7C3E6" wp14:editId="1323361C">
-            <wp:extent cx="5029200" cy="3151682"/>
-            <wp:effectExtent l="0" t="0" r="0" b="0"/>
+          <wp:inline distT="0" distB="0" distL="0" distR="0" wp14:anchorId="43F7C3E6" wp14:editId="316C8B3F">
+            <wp:extent cx="4820953" cy="3021178"/>
+            <wp:effectExtent l="0" t="0" r="0" b="8255"/>
             <wp:docPr id="5" name="Picture 5"/>
             <wp:cNvGraphicFramePr>
               <a:graphicFrameLocks xmlns:a="http://schemas.openxmlformats.org/drawingml/2006/main" noChangeAspect="1"/>
@@ -2265,7 +2496,7 @@
                     <pic:cNvPicPr/>
                   </pic:nvPicPr>
                   <pic:blipFill>
-                    <a:blip r:embed="rId22"/>
+                    <a:blip r:embed="rId24"/>
                     <a:stretch>
                       <a:fillRect/>
                     </a:stretch>
@@ -2273,7 +2504,7 @@
                   <pic:spPr>
                     <a:xfrm>
                       <a:off x="0" y="0"/>
-                      <a:ext cx="5029200" cy="3151682"/>
+                      <a:ext cx="4827749" cy="3025437"/>
                     </a:xfrm>
                     <a:prstGeom prst="rect">
                       <a:avLst/>
@@ -2302,9 +2533,12 @@
       <w:pPr>
         <w:pStyle w:val="Heading2"/>
       </w:pPr>
-      <w:r>
+      <w:bookmarkStart w:id="25" w:name="_Toc224004782"/>
+      <w:r>
+        <w:lastRenderedPageBreak/>
         <w:t>6.3 Next Steps</w:t>
       </w:r>
+      <w:bookmarkEnd w:id="25"/>
     </w:p>
     <w:p>
       <w:r>
@@ -2315,9 +2549,11 @@
       <w:pPr>
         <w:pStyle w:val="Heading2"/>
       </w:pPr>
+      <w:bookmarkStart w:id="26" w:name="_Toc224004783"/>
       <w:r>
         <w:t>6.4 Model Card</w:t>
       </w:r>
+      <w:bookmarkEnd w:id="26"/>
     </w:p>
     <w:tbl>
       <w:tblPr>
@@ -2444,7 +2680,7 @@
               <w:cnfStyle w:val="000000100000" w:firstRow="0" w:lastRow="0" w:firstColumn="0" w:lastColumn="0" w:oddVBand="0" w:evenVBand="0" w:oddHBand="1" w:evenHBand="0" w:firstRowFirstColumn="0" w:firstRowLastColumn="0" w:lastRowFirstColumn="0" w:lastRowLastColumn="0"/>
             </w:pPr>
             <w:r>
-              <w:t>H3 Resolution 9 (~174m edge, ~0.1 km2 per hexagon)</w:t>
+              <w:t>H3 Resolution 9 (~350m width, ~0.1 km2 per hexagon)</w:t>
             </w:r>
           </w:p>
         </w:tc>
@@ -2473,11 +2709,7 @@
               <w:cnfStyle w:val="000000000000" w:firstRow="0" w:lastRow="0" w:firstColumn="0" w:lastColumn="0" w:oddVBand="0" w:evenVBand="0" w:oddHBand="0" w:evenHBand="0" w:firstRowFirstColumn="0" w:firstRowLastColumn="0" w:lastRowFirstColumn="0" w:lastRowLastColumn="0"/>
             </w:pPr>
             <w:r>
-              <w:t>Spatial block CV (H3 Res-7 parent blocks), F1-</w:t>
-            </w:r>
-            <w:r>
-              <w:lastRenderedPageBreak/>
-              <w:t>optimal threshold tuning, per-type confusion matrices</w:t>
+              <w:t>Spatial block CV (H3 Res-7 parent blocks), F1-optimal threshold tuning, per-type confusion matrices</w:t>
             </w:r>
           </w:p>
         </w:tc>
@@ -2494,7 +2726,6 @@
           </w:tcPr>
           <w:p>
             <w:r>
-              <w:lastRenderedPageBreak/>
               <w:t>Key caveat</w:t>
             </w:r>
           </w:p>
@@ -2515,13 +2746,24 @@
       </w:tr>
     </w:tbl>
     <w:p/>
+    <w:p/>
+    <w:p/>
+    <w:p/>
+    <w:p/>
+    <w:p/>
+    <w:p/>
+    <w:p/>
+    <w:p/>
     <w:p>
       <w:pPr>
         <w:pStyle w:val="Heading1"/>
       </w:pPr>
-      <w:r>
+      <w:bookmarkStart w:id="27" w:name="_Toc224004784"/>
+      <w:r>
+        <w:lastRenderedPageBreak/>
         <w:t>References</w:t>
       </w:r>
+      <w:bookmarkEnd w:id="27"/>
     </w:p>
     <w:p>
       <w:pPr>
@@ -2616,8 +2858,32 @@
         <w:pStyle w:val="ListBullet"/>
       </w:pPr>
       <w:r>
+        <w:t>Sevtsuk, A. (2014) ‘Location and agglomeration: The distribution of retail and food businesses in dense urban environments’, Journal of Planning Education and Research, 34(4), pp. 374–393. Available at: https://doi.org/10.1177/0739456X14550401.</w:t>
+      </w:r>
+    </w:p>
+    <w:p>
+      <w:pPr>
+        <w:pStyle w:val="ListBullet"/>
+      </w:pPr>
+      <w:r>
+        <w:t>Taecharungroj, V. and Ntounis, N. (2024) ‘What amenities drive footfall in UK town centres? A machine learning approach using OpenStreetMap data’, Environment and Planning B: Urban Analytics and City Science, 52(6), pp. 1291–1309. Available at: https://doi.org/10.1177/23998083241290343.</w:t>
+      </w:r>
+    </w:p>
+    <w:p>
+      <w:pPr>
+        <w:pStyle w:val="ListBullet"/>
+      </w:pPr>
+      <w:r>
+        <w:t>Tobler, W.R. (1970) ‘A computer movie simulating urban growth in the Detroit region’, Economic Geography, 46(sup1), pp. 234–240. Available at: https://doi.org/10.2307/143141.</w:t>
+      </w:r>
+    </w:p>
+    <w:p>
+      <w:pPr>
+        <w:pStyle w:val="ListBullet"/>
+      </w:pPr>
+      <w:r>
         <w:lastRenderedPageBreak/>
-        <w:t>Sevtsuk, A. (2014) ‘Location and agglomeration: The distribution of retail and food businesses in dense urban environments’, Journal of Planning Education and Research, 34(4), pp. 374–393. Available at: https://doi.org/10.1177/0739456X14550401.</w:t>
+        <w:t>Uber Technologies (2024) H3: Hexagonal Hierarchical Geospatial Indexing System. Available at: https://h3geo.org/ (Accessed: 10 March 2026).</w:t>
       </w:r>
     </w:p>
     <w:p>
@@ -2625,30 +2891,6 @@
         <w:pStyle w:val="ListBullet"/>
       </w:pPr>
       <w:r>
-        <w:t>Taecharungroj, V. and Ntounis, N. (2024) ‘What amenities drive footfall in UK town centres? A machine learning approach using OpenStreetMap data’, Environment and Planning B: Urban Analytics and City Science, 52(6), pp. 1291–1309. Available at: https://doi.org/10.1177/23998083241290343.</w:t>
-      </w:r>
-    </w:p>
-    <w:p>
-      <w:pPr>
-        <w:pStyle w:val="ListBullet"/>
-      </w:pPr>
-      <w:r>
-        <w:t>Tobler, W.R. (1970) ‘A computer movie simulating urban growth in the Detroit region’, Economic Geography, 46(sup1), pp. 234–240. Available at: https://doi.org/10.2307/143141.</w:t>
-      </w:r>
-    </w:p>
-    <w:p>
-      <w:pPr>
-        <w:pStyle w:val="ListBullet"/>
-      </w:pPr>
-      <w:r>
-        <w:t>Uber Technologies (2024) H3: Hexagonal Hierarchical Geospatial Indexing System. Available at: https://h3geo.org/ (Accessed: 10 March 2026).</w:t>
-      </w:r>
-    </w:p>
-    <w:p>
-      <w:pPr>
-        <w:pStyle w:val="ListBullet"/>
-      </w:pPr>
-      <w:r>
         <w:t>Zhao, J., Zong, B. and Wu, L. (2023) ‘Site selection prediction for coffee shops based on multi-source space data using machine learning techniques’, ISPRS International Journal of Geo-Information, 12(8), 329. Available at: https://doi.org/10.3390/ijgi12080329.</w:t>
       </w:r>
     </w:p>
@@ -2657,9 +2899,11 @@
       <w:pPr>
         <w:pStyle w:val="Heading1"/>
       </w:pPr>
+      <w:bookmarkStart w:id="28" w:name="_Toc224004785"/>
       <w:r>
         <w:t>Appendix A: Agent Usage Log + Decision Register</w:t>
       </w:r>
+      <w:bookmarkEnd w:id="28"/>
     </w:p>
     <w:p>
       <w:r>
@@ -2673,9 +2917,11 @@
       <w:pPr>
         <w:pStyle w:val="Heading2"/>
       </w:pPr>
+      <w:bookmarkStart w:id="29" w:name="_Toc224004786"/>
       <w:r>
         <w:t>A.1 Interaction Log</w:t>
       </w:r>
+      <w:bookmarkEnd w:id="29"/>
     </w:p>
     <w:p>
       <w:pPr>
@@ -2725,13 +2971,14 @@
           <w:sz w:val="20"/>
           <w:szCs w:val="20"/>
         </w:rPr>
-        <w:t>Agent task: Generate polygon_to_cells code for filling borough boundaries with H3 Resolution-9 hexagons. Implement batch POI fetching with 3-endpoint rotation, exponential backoff, and auto-split fallback for dense boroughs.  My verification: Counted output hexagons (15,430) and divided Greater London’s area by hex area (~0.105 km²) — geometric estimate matched. Visually confirmed hex grid coverage against borough boundaries on a Pydeck map. Spot-checked POI counts for 5 boroughs against Google Maps. Result: Accepted.</w:t>
+        <w:t>Agent task: Generate polygon_to_cells code for filling borough boundaries with H3 Resolution-9 hexagons. Implement batch POI fetching with 3-endpoint rotation, exponential backoff, and auto-split fallback for dense boroughs.  My verification: Counted output hexagons (15,430) and divided Greater London’s area by hex area (~0.105 km²) — geometric estimate matched. Visually confirmed hex grid coverage against borough boundaries on a Pydeck map. Spot-checked POI counts for 5 boroughs against Google Maps. Result</w:t>
       </w:r>
       <w:r>
         <w:rPr>
           <w:sz w:val="20"/>
           <w:szCs w:val="20"/>
         </w:rPr>
+        <w:t>: Accepted.</w:t>
       </w:r>
     </w:p>
     <w:p>
@@ -2812,7 +3059,6 @@
           <w:sz w:val="21"/>
           <w:szCs w:val="21"/>
         </w:rPr>
-        <w:lastRenderedPageBreak/>
         <w:t>[REJECTED]  Interaction 3: Rejection — Default 0.5 Classification Threshold (Entry #26)</w:t>
       </w:r>
     </w:p>
@@ -2838,13 +3084,14 @@
           <w:sz w:val="20"/>
           <w:szCs w:val="20"/>
         </w:rPr>
-        <w:t>The interactive 3D map showed an excessive number of green (False Positive) hexagons — the model was recommending almost everywhere. Four contributing factors identified: (1) default 0.5 probability threshold with no principled tuning, (2) predictions on training data, (3) no secondary filtering, (4) map rendered every FP equally regardless of confidence.  My decision: Replaced with F₁-optimal threshold tuning using precision-recall curves, shifting thresholds to 0.72–0.82 per business type. Reduced false positive recommendations by ~40%.</w:t>
+        <w:t>The interactive 3D map showed an excessive number of green (False Positive) hexagons — the model was recommending almost everywhere. Four contributing factors identified: (1) default 0.5 probability threshold with no principled tuning, (2) predictions on training data, (3) no secondary filtering, (4) map rendered every FP equally regardless of confidence.  My decision: Replaced with F₁-optimal threshold tuning using precision-recall curves, shifting thresholds to 0.72–0.82 per business type. Reduced false p</w:t>
       </w:r>
       <w:r>
         <w:rPr>
           <w:sz w:val="20"/>
           <w:szCs w:val="20"/>
         </w:rPr>
+        <w:t>ositive recommendations by ~40%.</w:t>
       </w:r>
     </w:p>
     <w:p>
@@ -2872,6 +3119,7 @@
           <w:sz w:val="21"/>
           <w:szCs w:val="21"/>
         </w:rPr>
+        <w:lastRenderedPageBreak/>
         <w:t>[ERROR CAUGHT]  Interaction 4: Error Correction — Westminster Geocoding Bug (Entries #30–42)</w:t>
       </w:r>
     </w:p>
@@ -2972,9 +3220,11 @@
       <w:pPr>
         <w:pStyle w:val="Heading2"/>
       </w:pPr>
+      <w:bookmarkStart w:id="30" w:name="_Toc224004787"/>
       <w:r>
         <w:t>A.2 Decision Register</w:t>
       </w:r>
+      <w:bookmarkEnd w:id="30"/>
     </w:p>
     <w:p>
       <w:r>
@@ -3463,14 +3713,7 @@
               <w:rPr>
                 <w:sz w:val="17"/>
               </w:rPr>
-              <w:t xml:space="preserve">office: True wildcard Overpass </w:t>
-            </w:r>
-            <w:r>
-              <w:rPr>
-                <w:sz w:val="17"/>
-              </w:rPr>
-              <w:lastRenderedPageBreak/>
-              <w:t>tag</w:t>
+              <w:t>office: True wildcard Overpass tag</w:t>
             </w:r>
           </w:p>
         </w:tc>
@@ -3484,7 +3727,6 @@
                 <w:color w:val="C0392B"/>
                 <w:sz w:val="17"/>
               </w:rPr>
-              <w:lastRenderedPageBreak/>
               <w:t>Rejected</w:t>
             </w:r>
           </w:p>
@@ -3881,6 +4123,7 @@
               <w:rPr>
                 <w:sz w:val="17"/>
               </w:rPr>
+              <w:lastRenderedPageBreak/>
               <w:t>12</w:t>
             </w:r>
           </w:p>
@@ -4036,7 +4279,7 @@
               <w:rPr>
                 <w:sz w:val="17"/>
               </w:rPr>
-              <w:t>72-entry collaboration log structure</w:t>
+              <w:t>101-entry collaboration log structure</w:t>
             </w:r>
           </w:p>
         </w:tc>
@@ -4107,7 +4350,7 @@
               <w:rPr>
                 <w:sz w:val="17"/>
               </w:rPr>
-              <w:t>Report prose (1,908 words)</w:t>
+              <w:t>Report prose (~1,992 words)</w:t>
             </w:r>
           </w:p>
         </w:tc>
@@ -4182,6 +4425,7 @@
       </w:r>
     </w:p>
     <w:sectPr>
+      <w:headerReference w:type="default" r:id="rId25"/>
       <w:pgSz w:w="12240" w:h="15840"/>
       <w:pgMar w:top="1440" w:right="1440" w:bottom="1440" w:left="1440" w:header="720" w:footer="720" w:gutter="0"/>
       <w:cols w:space="720"/>
@@ -4189,6 +4433,101 @@
     </w:sectPr>
   </w:body>
 </w:document>
+</file>
+
+<file path=word/endnotes.xml><?xml version="1.0" encoding="utf-8"?>
+<w:endnotes xmlns:wpc="http://schemas.microsoft.com/office/word/2010/wordprocessingCanvas" xmlns:cx="http://schemas.microsoft.com/office/drawing/2014/chartex" xmlns:cx1="http://schemas.microsoft.com/office/drawing/2015/9/8/chartex" xmlns:cx2="http://schemas.microsoft.com/office/drawing/2015/10/21/chartex" xmlns:cx3="http://schemas.microsoft.com/office/drawing/2016/5/9/chartex" xmlns:cx4="http://schemas.microsoft.com/office/drawing/2016/5/10/chartex" xmlns:cx5="http://schemas.microsoft.com/office/drawing/2016/5/11/chartex" xmlns:cx6="http://schemas.microsoft.com/office/drawing/2016/5/12/chartex" xmlns:cx7="http://schemas.microsoft.com/office/drawing/2016/5/13/chartex" xmlns:cx8="http://schemas.microsoft.com/office/drawing/2016/5/14/chartex" xmlns:mc="http://schemas.openxmlformats.org/markup-compatibility/2006" xmlns:aink="http://schemas.microsoft.com/office/drawing/2016/ink" xmlns:am3d="http://schemas.microsoft.com/office/drawing/2017/model3d" xmlns:o="urn:schemas-microsoft-com:office:office" xmlns:oel="http://schemas.microsoft.com/office/2019/extlst" xmlns:r="http://schemas.openxmlformats.org/officeDocument/2006/relationships" xmlns:m="http://schemas.openxmlformats.org/officeDocument/2006/math" xmlns:v="urn:schemas-microsoft-com:vml" xmlns:wp14="http://schemas.microsoft.com/office/word/2010/wordprocessingDrawing" xmlns:wp="http://schemas.openxmlformats.org/drawingml/2006/wordprocessingDrawing" xmlns:w10="urn:schemas-microsoft-com:office:word" xmlns:w="http://schemas.openxmlformats.org/wordprocessingml/2006/main" xmlns:w14="http://schemas.microsoft.com/office/word/2010/wordml" xmlns:w15="http://schemas.microsoft.com/office/word/2012/wordml" xmlns:w16cex="http://schemas.microsoft.com/office/word/2018/wordml/cex" xmlns:w16cid="http://schemas.microsoft.com/office/word/2016/wordml/cid" xmlns:w16="http://schemas.microsoft.com/office/word/2018/wordml" xmlns:w16du="http://schemas.microsoft.com/office/word/2023/wordml/word16du" xmlns:w16sdtdh="http://schemas.microsoft.com/office/word/2020/wordml/sdtdatahash" xmlns:w16sdtfl="http://schemas.microsoft.com/office/word/2024/wordml/sdtformatlock" xmlns:w16se="http://schemas.microsoft.com/office/word/2015/wordml/symex" xmlns:wpg="http://schemas.microsoft.com/office/word/2010/wordprocessingGroup" xmlns:wpi="http://schemas.microsoft.com/office/word/2010/wordprocessingInk" xmlns:wne="http://schemas.microsoft.com/office/word/2006/wordml" xmlns:wps="http://schemas.microsoft.com/office/word/2010/wordprocessingShape" mc:Ignorable="w14 w15 w16se w16cid w16 w16cex w16sdtdh w16sdtfl w16du wp14">
+  <w:endnote w:type="separator" w:id="-1">
+    <w:p>
+      <w:pPr>
+        <w:spacing w:after="0" w:line="240" w:lineRule="auto"/>
+      </w:pPr>
+      <w:r>
+        <w:separator/>
+      </w:r>
+    </w:p>
+  </w:endnote>
+  <w:endnote w:type="continuationSeparator" w:id="0">
+    <w:p>
+      <w:pPr>
+        <w:spacing w:after="0" w:line="240" w:lineRule="auto"/>
+      </w:pPr>
+      <w:r>
+        <w:continuationSeparator/>
+      </w:r>
+    </w:p>
+  </w:endnote>
+</w:endnotes>
+</file>
+
+<file path=word/footnotes.xml><?xml version="1.0" encoding="utf-8"?>
+<w:footnotes xmlns:wpc="http://schemas.microsoft.com/office/word/2010/wordprocessingCanvas" xmlns:cx="http://schemas.microsoft.com/office/drawing/2014/chartex" xmlns:cx1="http://schemas.microsoft.com/office/drawing/2015/9/8/chartex" xmlns:cx2="http://schemas.microsoft.com/office/drawing/2015/10/21/chartex" xmlns:cx3="http://schemas.microsoft.com/office/drawing/2016/5/9/chartex" xmlns:cx4="http://schemas.microsoft.com/office/drawing/2016/5/10/chartex" xmlns:cx5="http://schemas.microsoft.com/office/drawing/2016/5/11/chartex" xmlns:cx6="http://schemas.microsoft.com/office/drawing/2016/5/12/chartex" xmlns:cx7="http://schemas.microsoft.com/office/drawing/2016/5/13/chartex" xmlns:cx8="http://schemas.microsoft.com/office/drawing/2016/5/14/chartex" xmlns:mc="http://schemas.openxmlformats.org/markup-compatibility/2006" xmlns:aink="http://schemas.microsoft.com/office/drawing/2016/ink" xmlns:am3d="http://schemas.microsoft.com/office/drawing/2017/model3d" xmlns:o="urn:schemas-microsoft-com:office:office" xmlns:oel="http://schemas.microsoft.com/office/2019/extlst" xmlns:r="http://schemas.openxmlformats.org/officeDocument/2006/relationships" xmlns:m="http://schemas.openxmlformats.org/officeDocument/2006/math" xmlns:v="urn:schemas-microsoft-com:vml" xmlns:wp14="http://schemas.microsoft.com/office/word/2010/wordprocessingDrawing" xmlns:wp="http://schemas.openxmlformats.org/drawingml/2006/wordprocessingDrawing" xmlns:w10="urn:schemas-microsoft-com:office:word" xmlns:w="http://schemas.openxmlformats.org/wordprocessingml/2006/main" xmlns:w14="http://schemas.microsoft.com/office/word/2010/wordml" xmlns:w15="http://schemas.microsoft.com/office/word/2012/wordml" xmlns:w16cex="http://schemas.microsoft.com/office/word/2018/wordml/cex" xmlns:w16cid="http://schemas.microsoft.com/office/word/2016/wordml/cid" xmlns:w16="http://schemas.microsoft.com/office/word/2018/wordml" xmlns:w16du="http://schemas.microsoft.com/office/word/2023/wordml/word16du" xmlns:w16sdtdh="http://schemas.microsoft.com/office/word/2020/wordml/sdtdatahash" xmlns:w16sdtfl="http://schemas.microsoft.com/office/word/2024/wordml/sdtformatlock" xmlns:w16se="http://schemas.microsoft.com/office/word/2015/wordml/symex" xmlns:wpg="http://schemas.microsoft.com/office/word/2010/wordprocessingGroup" xmlns:wpi="http://schemas.microsoft.com/office/word/2010/wordprocessingInk" xmlns:wne="http://schemas.microsoft.com/office/word/2006/wordml" xmlns:wps="http://schemas.microsoft.com/office/word/2010/wordprocessingShape" mc:Ignorable="w14 w15 w16se w16cid w16 w16cex w16sdtdh w16sdtfl w16du wp14">
+  <w:footnote w:type="separator" w:id="-1">
+    <w:p>
+      <w:pPr>
+        <w:spacing w:after="0" w:line="240" w:lineRule="auto"/>
+      </w:pPr>
+      <w:r>
+        <w:separator/>
+      </w:r>
+    </w:p>
+  </w:footnote>
+  <w:footnote w:type="continuationSeparator" w:id="0">
+    <w:p>
+      <w:pPr>
+        <w:spacing w:after="0" w:line="240" w:lineRule="auto"/>
+      </w:pPr>
+      <w:r>
+        <w:continuationSeparator/>
+      </w:r>
+    </w:p>
+  </w:footnote>
+</w:footnotes>
+</file>
+
+<file path=word/header1.xml><?xml version="1.0" encoding="utf-8"?>
+<w:hdr xmlns:wpc="http://schemas.microsoft.com/office/word/2010/wordprocessingCanvas" xmlns:cx="http://schemas.microsoft.com/office/drawing/2014/chartex" xmlns:cx1="http://schemas.microsoft.com/office/drawing/2015/9/8/chartex" xmlns:cx2="http://schemas.microsoft.com/office/drawing/2015/10/21/chartex" xmlns:cx3="http://schemas.microsoft.com/office/drawing/2016/5/9/chartex" xmlns:cx4="http://schemas.microsoft.com/office/drawing/2016/5/10/chartex" xmlns:cx5="http://schemas.microsoft.com/office/drawing/2016/5/11/chartex" xmlns:cx6="http://schemas.microsoft.com/office/drawing/2016/5/12/chartex" xmlns:cx7="http://schemas.microsoft.com/office/drawing/2016/5/13/chartex" xmlns:cx8="http://schemas.microsoft.com/office/drawing/2016/5/14/chartex" xmlns:mc="http://schemas.openxmlformats.org/markup-compatibility/2006" xmlns:aink="http://schemas.microsoft.com/office/drawing/2016/ink" xmlns:am3d="http://schemas.microsoft.com/office/drawing/2017/model3d" xmlns:o="urn:schemas-microsoft-com:office:office" xmlns:oel="http://schemas.microsoft.com/office/2019/extlst" xmlns:r="http://schemas.openxmlformats.org/officeDocument/2006/relationships" xmlns:m="http://schemas.openxmlformats.org/officeDocument/2006/math" xmlns:v="urn:schemas-microsoft-com:vml" xmlns:wp14="http://schemas.microsoft.com/office/word/2010/wordprocessingDrawing" xmlns:wp="http://schemas.openxmlformats.org/drawingml/2006/wordprocessingDrawing" xmlns:w10="urn:schemas-microsoft-com:office:word" xmlns:w="http://schemas.openxmlformats.org/wordprocessingml/2006/main" xmlns:w14="http://schemas.microsoft.com/office/word/2010/wordml" xmlns:w15="http://schemas.microsoft.com/office/word/2012/wordml" xmlns:w16cex="http://schemas.microsoft.com/office/word/2018/wordml/cex" xmlns:w16cid="http://schemas.microsoft.com/office/word/2016/wordml/cid" xmlns:w16="http://schemas.microsoft.com/office/word/2018/wordml" xmlns:w16du="http://schemas.microsoft.com/office/word/2023/wordml/word16du" xmlns:w16sdtdh="http://schemas.microsoft.com/office/word/2020/wordml/sdtdatahash" xmlns:w16sdtfl="http://schemas.microsoft.com/office/word/2024/wordml/sdtformatlock" xmlns:w16se="http://schemas.microsoft.com/office/word/2015/wordml/symex" xmlns:wpg="http://schemas.microsoft.com/office/word/2010/wordprocessingGroup" xmlns:wpi="http://schemas.microsoft.com/office/word/2010/wordprocessingInk" xmlns:wne="http://schemas.microsoft.com/office/word/2006/wordml" xmlns:wps="http://schemas.microsoft.com/office/word/2010/wordprocessingShape" mc:Ignorable="w14 w15 w16se w16cid w16 w16cex w16sdtdh w16sdtfl w16du wp14">
+  <w:sdt>
+    <w:sdtPr>
+      <w:id w:val="291945818"/>
+      <w:docPartObj>
+        <w:docPartGallery w:val="Page Numbers (Top of Page)"/>
+        <w:docPartUnique/>
+      </w:docPartObj>
+    </w:sdtPr>
+    <w:sdtContent>
+      <w:p>
+        <w:pPr>
+          <w:pStyle w:val="Header"/>
+          <w:jc w:val="right"/>
+        </w:pPr>
+        <w:r>
+          <w:fldChar w:fldCharType="begin"/>
+        </w:r>
+        <w:r>
+          <w:instrText>PAGE   \* MERGEFORMAT</w:instrText>
+        </w:r>
+        <w:r>
+          <w:fldChar w:fldCharType="separate"/>
+        </w:r>
+        <w:r>
+          <w:rPr>
+            <w:lang w:val="en-GB"/>
+          </w:rPr>
+          <w:t>2</w:t>
+        </w:r>
+        <w:r>
+          <w:fldChar w:fldCharType="end"/>
+        </w:r>
+      </w:p>
+    </w:sdtContent>
+  </w:sdt>
+  <w:p>
+    <w:pPr>
+      <w:pStyle w:val="Header"/>
+    </w:pPr>
+  </w:p>
+</w:hdr>
 </file>
 
 <file path=word/numbering.xml><?xml version="1.0" encoding="utf-8"?>
@@ -5001,6 +5340,7 @@
   <w:style w:type="character" w:default="1" w:styleId="DefaultParagraphFont">
     <w:name w:val="Default Paragraph Font"/>
     <w:uiPriority w:val="1"/>
+    <w:semiHidden/>
     <w:unhideWhenUsed/>
   </w:style>
   <w:style w:type="table" w:default="1" w:styleId="TableNormal">
@@ -5716,7 +6056,6 @@
     <w:basedOn w:val="Heading1"/>
     <w:next w:val="Normal"/>
     <w:uiPriority w:val="39"/>
-    <w:semiHidden/>
     <w:unhideWhenUsed/>
     <w:qFormat/>
     <w:rsid w:val="00FC693F"/>
@@ -15777,6 +16116,42 @@
         <w:shd w:val="clear" w:color="auto" w:fill="FBCAA2" w:themeFill="accent6" w:themeFillTint="7F"/>
       </w:tcPr>
     </w:tblStylePr>
+  </w:style>
+  <w:style w:type="paragraph" w:styleId="TOC1">
+    <w:name w:val="toc 1"/>
+    <w:basedOn w:val="Normal"/>
+    <w:next w:val="Normal"/>
+    <w:autoRedefine/>
+    <w:uiPriority w:val="39"/>
+    <w:unhideWhenUsed/>
+    <w:rsid w:val="00610415"/>
+    <w:pPr>
+      <w:spacing w:after="100"/>
+    </w:pPr>
+  </w:style>
+  <w:style w:type="paragraph" w:styleId="TOC2">
+    <w:name w:val="toc 2"/>
+    <w:basedOn w:val="Normal"/>
+    <w:next w:val="Normal"/>
+    <w:autoRedefine/>
+    <w:uiPriority w:val="39"/>
+    <w:unhideWhenUsed/>
+    <w:rsid w:val="00610415"/>
+    <w:pPr>
+      <w:spacing w:after="100"/>
+      <w:ind w:left="220"/>
+    </w:pPr>
+  </w:style>
+  <w:style w:type="character" w:styleId="Hyperlink">
+    <w:name w:val="Hyperlink"/>
+    <w:basedOn w:val="DefaultParagraphFont"/>
+    <w:uiPriority w:val="99"/>
+    <w:unhideWhenUsed/>
+    <w:rsid w:val="00610415"/>
+    <w:rPr>
+      <w:color w:val="0000FF" w:themeColor="hyperlink"/>
+      <w:u w:val="single"/>
+    </w:rPr>
   </w:style>
 </w:styles>
 </file>

</xml_diff>